<commit_message>
migrate to stg db
</commit_message>
<xml_diff>
--- a/public/docs/Panduan_Cuti_Corinthian.docx
+++ b/public/docs/Panduan_Cuti_Corinthian.docx
@@ -244,18 +244,18 @@
           <w:sz w:val="22"/>
           <w:szCs w:val="22"/>
         </w:rPr>
-        <w:t xml:space="preserve">Karyawan Kontrak (C): </w:t>
-      </w:r>
-      <w:r>
-        <w:rPr>
-          <w:rFonts w:ascii="Arial" w:cs="Arial" w:eastAsia="Arial" w:hAnsi="Arial"/>
-          <w:b w:val="false"/>
-          <w:bCs w:val="false"/>
-          <w:color w:val="111827"/>
-          <w:sz w:val="22"/>
-          <w:szCs w:val="22"/>
-        </w:rPr>
-        <w:t xml:space="preserve">Dihitung dari tanggal mulai kontrak (Contract Start Date).</w:t>
+        <w:t xml:space="preserve">Prioritas: </w:t>
+      </w:r>
+      <w:r>
+        <w:rPr>
+          <w:rFonts w:ascii="Arial" w:cs="Arial" w:eastAsia="Arial" w:hAnsi="Arial"/>
+          <w:b w:val="false"/>
+          <w:bCs w:val="false"/>
+          <w:color w:val="111827"/>
+          <w:sz w:val="22"/>
+          <w:szCs w:val="22"/>
+        </w:rPr>
+        <w:t xml:space="preserve">Contract Start Date dipakai kalau ada isinya — berlaku untuk Kontrak maupun Tetap.</w:t>
       </w:r>
     </w:p>
     <w:p>
@@ -276,18 +276,18 @@
           <w:sz w:val="22"/>
           <w:szCs w:val="22"/>
         </w:rPr>
-        <w:t xml:space="preserve">Karyawan Tetap (P): </w:t>
-      </w:r>
-      <w:r>
-        <w:rPr>
-          <w:rFonts w:ascii="Arial" w:cs="Arial" w:eastAsia="Arial" w:hAnsi="Arial"/>
-          <w:b w:val="false"/>
-          <w:bCs w:val="false"/>
-          <w:color w:val="111827"/>
-          <w:sz w:val="22"/>
-          <w:szCs w:val="22"/>
-        </w:rPr>
-        <w:t xml:space="preserve">Dihitung dari tanggal efektif pengangkatan tetap (Effective Permanent Date).</w:t>
+        <w:t xml:space="preserve">Fallback: </w:t>
+      </w:r>
+      <w:r>
+        <w:rPr>
+          <w:rFonts w:ascii="Arial" w:cs="Arial" w:eastAsia="Arial" w:hAnsi="Arial"/>
+          <w:b w:val="false"/>
+          <w:bCs w:val="false"/>
+          <w:color w:val="111827"/>
+          <w:sz w:val="22"/>
+          <w:szCs w:val="22"/>
+        </w:rPr>
+        <w:t xml:space="preserve">Effective Permanent Date hanya dipakai kalau Contract Start Date kosong.</w:t>
       </w:r>
     </w:p>
     <w:p>
@@ -410,18 +410,18 @@
           <w:sz w:val="22"/>
           <w:szCs w:val="22"/>
         </w:rPr>
-        <w:t xml:space="preserve">Karyawan Kontrak (C): </w:t>
-      </w:r>
-      <w:r>
-        <w:rPr>
-          <w:rFonts w:ascii="Arial" w:cs="Arial" w:eastAsia="Arial" w:hAnsi="Arial"/>
-          <w:b w:val="false"/>
-          <w:bCs w:val="false"/>
-          <w:color w:val="111827"/>
-          <w:sz w:val="22"/>
-          <w:szCs w:val="22"/>
-        </w:rPr>
-        <w:t xml:space="preserve">Berlaku setelah 1 tahun dari Contract Start Date.</w:t>
+        <w:t xml:space="preserve">Prioritas: </w:t>
+      </w:r>
+      <w:r>
+        <w:rPr>
+          <w:rFonts w:ascii="Arial" w:cs="Arial" w:eastAsia="Arial" w:hAnsi="Arial"/>
+          <w:b w:val="false"/>
+          <w:bCs w:val="false"/>
+          <w:color w:val="111827"/>
+          <w:sz w:val="22"/>
+          <w:szCs w:val="22"/>
+        </w:rPr>
+        <w:t xml:space="preserve">Berlaku setelah 1 tahun dari Contract Start Date, kalau ada isinya — berlaku untuk Kontrak maupun Tetap.</w:t>
       </w:r>
     </w:p>
     <w:p>
@@ -442,18 +442,18 @@
           <w:sz w:val="22"/>
           <w:szCs w:val="22"/>
         </w:rPr>
-        <w:t xml:space="preserve">Karyawan Tetap (P): </w:t>
-      </w:r>
-      <w:r>
-        <w:rPr>
-          <w:rFonts w:ascii="Arial" w:cs="Arial" w:eastAsia="Arial" w:hAnsi="Arial"/>
-          <w:b w:val="false"/>
-          <w:bCs w:val="false"/>
-          <w:color w:val="111827"/>
-          <w:sz w:val="22"/>
-          <w:szCs w:val="22"/>
-        </w:rPr>
-        <w:t xml:space="preserve">Berlaku setelah 1 tahun dari Effective Permanent Date.</w:t>
+        <w:t xml:space="preserve">Fallback: </w:t>
+      </w:r>
+      <w:r>
+        <w:rPr>
+          <w:rFonts w:ascii="Arial" w:cs="Arial" w:eastAsia="Arial" w:hAnsi="Arial"/>
+          <w:b w:val="false"/>
+          <w:bCs w:val="false"/>
+          <w:color w:val="111827"/>
+          <w:sz w:val="22"/>
+          <w:szCs w:val="22"/>
+        </w:rPr>
+        <w:t xml:space="preserve">Berlaku setelah 1 tahun dari Effective Permanent Date, hanya kalau Contract Start Date kosong.</w:t>
       </w:r>
     </w:p>
     <w:p>
@@ -735,7 +735,7 @@
           <w:sz w:val="22"/>
           <w:szCs w:val="22"/>
         </w:rPr>
-        <w:t xml:space="preserve">Karyawan Kontrak menggunakan Contract Start Date; Karyawan Tetap menggunakan Effective Permanent Date.</w:t>
+        <w:t xml:space="preserve">Contract Start Date selalu diprioritaskan kalau ada isinya; Effective Permanent Date hanya dipakai sebagai fallback kalau Contract Start Date kosong. Berlaku sama untuk Kontrak maupun Tetap.</w:t>
       </w:r>
     </w:p>
     <w:p>
@@ -1586,7 +1586,7 @@
           <w:sz w:val="22"/>
           <w:szCs w:val="22"/>
         </w:rPr>
-        <w:t xml:space="preserve">Jika saldo AL sudah 20 hari, tidak ada penambahan sampai saldo dikurangi.</w:t>
+        <w:t xml:space="preserve">Jika saldo AL sudah 20 hari, GRANT12/MONTHLY+1 tidak menambah saldo — namun proses tetap dicatat di riwayat top-up (saldo sebelum dan sesudah sama-sama 20 hari) untuk keperluan audit, tidak di-skip diam-diam.</w:t>
       </w:r>
     </w:p>
     <w:p>

</xml_diff>